<commit_message>
Update CV and portfolio with Mounir Academy teaching and EdTech/LMS platform engineering
</commit_message>
<xml_diff>
--- a/Ahmed_Yousef_Science_Teacher_CV.docx
+++ b/Ahmed_Yousef_Science_Teacher_CV.docx
@@ -25,7 +25,7 @@
           <w:color w:val="475569"/>
           <w:sz w:val="21"/>
         </w:rPr>
-        <w:t>CERTIFIED SCIENCE &amp; CHEMISTRY TEACHER | STEM &amp; EDTECH SPECIALIST</w:t>
+        <w:t>CERTIFIED SCIENCE &amp; CHEMISTRY TEACHER | EDTECH &amp; LMS SPECIALIST</w:t>
         <w:br/>
       </w:r>
       <w:r>
@@ -38,7 +38,7 @@
     </w:p>
     <w:p>
       <w:pPr>
-        <w:spacing w:before="180" w:after="60"/>
+        <w:spacing w:before="160" w:after="60"/>
         <w:pBdr>
           <w:bottom w:val="single" w:sz="8" w:space="4" w:color="CBD5E1"/>
         </w:pBdr>
@@ -60,12 +60,12 @@
         <w:rPr>
           <w:sz w:val="19"/>
         </w:rPr>
-        <w:t>Passionate, certified Science &amp; Chemistry Educator with a strong dual background in Biophysics &amp; Chemistry (Faculty of Science) and a Postgraduate Professional Educator Diploma (Faculty of Education). Dedicated to fostering scientific inquiry, critical thinking, and intellectual curiosity within international curriculum frameworks (American Diploma, British / Cambridge IGCSE, and IB). Highly skilled in student-centered instruction, laboratory experimentation, differentiated learning, and modern Educational Technology (EdTech) integration to drive both academic excellence and genuine enthusiasm for the sciences.</w:t>
+        <w:t>Dynamic, certified Science &amp; Chemistry Educator and EdTech Developer combining strong academic foundations in Biophysics &amp; Chemistry (Faculty of Science) with a Postgraduate Diploma in Education (PGDE - Faculty of Education). Demonstrated track record at Mounir Academy delivering student-centered, inquiry-based instruction across international curricula (Cambridge IGCSE, American NGSS, and Middle School Science). Proven expertise in developing custom educational platforms (LMS), laboratory safety, differentiated instruction, and integrating PhET interactive simulations to cultivate scientific curiosity, critical inquiry, and academic excellence.</w:t>
       </w:r>
     </w:p>
     <w:p>
       <w:pPr>
-        <w:spacing w:before="180" w:after="60"/>
+        <w:spacing w:before="160" w:after="60"/>
         <w:pBdr>
           <w:bottom w:val="single" w:sz="8" w:space="4" w:color="CBD5E1"/>
         </w:pBdr>
@@ -109,7 +109,7 @@
           <w:color w:val="475569"/>
           <w:sz w:val="18"/>
         </w:rPr>
-        <w:t>Specialized in Educational Psychology, Modern Pedagogical Methods, Curriculum Design, Classroom Management, and Learning Assessment Strategies.</w:t>
+        <w:t>Focus: Educational Psychology, Modern Teaching Methodologies, Curriculum Planning, Classroom Management &amp; Positive Discipline, Learning Assessment Strategies.</w:t>
       </w:r>
     </w:p>
     <w:p>
@@ -147,7 +147,7 @@
     </w:p>
     <w:p>
       <w:pPr>
-        <w:spacing w:before="180" w:after="60"/>
+        <w:spacing w:before="160" w:after="60"/>
         <w:pBdr>
           <w:bottom w:val="single" w:sz="8" w:space="4" w:color="CBD5E1"/>
         </w:pBdr>
@@ -158,7 +158,7 @@
           <w:color w:val="1E3A8A"/>
           <w:sz w:val="22"/>
         </w:rPr>
-        <w:t>CORE TEACHING COMPETENCIES</w:t>
+        <w:t>CORE TEACHING &amp; PEDAGOGICAL COMPETENCIES</w:t>
       </w:r>
     </w:p>
     <w:p>
@@ -179,7 +179,7 @@
         <w:rPr>
           <w:sz w:val="19"/>
         </w:rPr>
-        <w:t>Inquiry-Based Learning (IBL), STEM Education, Differentiated Instruction, Lesson &amp; Unit Design, Formative &amp; Summative Assessments, Student-Centered Active Learning.</w:t>
+        <w:t>Inquiry-Based Learning (IBL), STEM Education, 5E Instructional Model, Differentiated Instruction, Lesson &amp; Unit Design, Formative &amp; Summative Assessments, Student-Centered Learning.</w:t>
       </w:r>
     </w:p>
     <w:p>
@@ -200,7 +200,28 @@
         <w:rPr>
           <w:sz w:val="19"/>
         </w:rPr>
-        <w:t>General Science (Middle School / Key Stage 3), Chemistry (High School / IGCSE / American Curriculum), Biophysics &amp; Integrated Physical Sciences, Laboratory Safety &amp; Experimental Design.</w:t>
+        <w:t>General Science (Middle School / Key Stage 3), Chemistry (High School / IGCSE / American Curriculum), Biophysics &amp; Integrated Physical Sciences, Laboratory Safety &amp; Risk Management.</w:t>
+      </w:r>
+    </w:p>
+    <w:p>
+      <w:pPr>
+        <w:pStyle w:val="ListBullet"/>
+        <w:spacing w:after="40"/>
+        <w:ind w:left="317"/>
+      </w:pPr>
+      <w:r>
+        <w:rPr>
+          <w:b/>
+          <w:color w:val="0F172A"/>
+          <w:sz w:val="19"/>
+        </w:rPr>
+        <w:t xml:space="preserve">Educational Platforms &amp; EdTech: </w:t>
+      </w:r>
+      <w:r>
+        <w:rPr>
+          <w:sz w:val="19"/>
+        </w:rPr>
+        <w:t>LMS Architecture &amp; Deployment, Google Classroom, MS Teams for Education, PhET Interactive Simulations, Virtual Labs, Automated Grading Systems, Digital Assessment Platforms.</w:t>
       </w:r>
     </w:p>
     <w:p>
@@ -221,33 +242,12 @@
         <w:rPr>
           <w:sz w:val="19"/>
         </w:rPr>
-        <w:t>Positive Behavioral Support, Student Mentorship &amp; Academic Guidance, Fostering Growth Mindset, Cultivating Inclusive Learning Environments, Effective Parent-Teacher Partnership.</w:t>
+        <w:t>Positive Behavioral Support, Student Mentorship &amp; Academic Guidance, Fostering Growth Mindset, Cultivating Inclusive Learning Environments, Transparent Parent-Teacher Partnership.</w:t>
       </w:r>
     </w:p>
     <w:p>
       <w:pPr>
-        <w:pStyle w:val="ListBullet"/>
-        <w:spacing w:after="40"/>
-        <w:ind w:left="317"/>
-      </w:pPr>
-      <w:r>
-        <w:rPr>
-          <w:b/>
-          <w:color w:val="0F172A"/>
-          <w:sz w:val="19"/>
-        </w:rPr>
-        <w:t xml:space="preserve">Educational Technology: </w:t>
-      </w:r>
-      <w:r>
-        <w:rPr>
-          <w:sz w:val="19"/>
-        </w:rPr>
-        <w:t>Google Classroom, Microsoft 365 for Education, PhET Interactive Simulations, Virtual Labs, Quizizz / Kahoot, Interactive Whiteboards, Digital LMS &amp; Analytics.</w:t>
-      </w:r>
-    </w:p>
-    <w:p>
-      <w:pPr>
-        <w:spacing w:before="180" w:after="60"/>
+        <w:spacing w:before="160" w:after="60"/>
         <w:pBdr>
           <w:bottom w:val="single" w:sz="8" w:space="4" w:color="CBD5E1"/>
         </w:pBdr>
@@ -271,92 +271,79 @@
           <w:color w:val="0F172A"/>
           <w:sz w:val="20"/>
         </w:rPr>
-        <w:t>Science &amp; Chemistry Educator (Academic Tutoring &amp; Student Instruction)</w:t>
+        <w:t>Science &amp; Chemistry Teacher</w:t>
       </w:r>
       <w:r>
         <w:rPr>
           <w:i/>
           <w:sz w:val="19"/>
         </w:rPr>
-        <w:t xml:space="preserve">  |  Alexandria, Egypt (2021 – Present)</w:t>
+        <w:t xml:space="preserve">  |  Mounir Educational Academy  •  Alexandria, Egypt (2022 – Present)</w:t>
       </w:r>
     </w:p>
     <w:p>
       <w:pPr>
         <w:pStyle w:val="ListBullet"/>
-        <w:spacing w:after="40"/>
+        <w:spacing w:after="36"/>
         <w:ind w:left="317"/>
       </w:pPr>
       <w:r>
         <w:rPr>
           <w:sz w:val="18"/>
         </w:rPr>
-        <w:t>Deliver rigorous, student-focused instruction in Middle School General Science and High School Chemistry aligned with international curriculum standards (Cambridge / IGCSE and American NGSS frameworks).</w:t>
+        <w:t>Deliver student-centered instruction in Middle School General Science and High School Chemistry aligned with international curriculum frameworks (Cambridge IGCSE and American NGSS).</w:t>
       </w:r>
     </w:p>
     <w:p>
       <w:pPr>
         <w:pStyle w:val="ListBullet"/>
-        <w:spacing w:after="40"/>
+        <w:spacing w:after="36"/>
         <w:ind w:left="317"/>
       </w:pPr>
       <w:r>
         <w:rPr>
           <w:sz w:val="18"/>
         </w:rPr>
-        <w:t>Design inquiry-based, hands-on lesson modules that translate complex theoretical chemistry and physics concepts into tangible real-world demonstrations, significantly elevating conceptual retention.</w:t>
+        <w:t>Design inquiry-based lesson plans that connect abstract chemical and physical principles to everyday phenomena, fostering active curiosity and analytical problem-solving skills.</w:t>
       </w:r>
     </w:p>
     <w:p>
       <w:pPr>
         <w:pStyle w:val="ListBullet"/>
-        <w:spacing w:after="40"/>
+        <w:spacing w:after="36"/>
         <w:ind w:left="317"/>
       </w:pPr>
       <w:r>
         <w:rPr>
           <w:sz w:val="18"/>
         </w:rPr>
-        <w:t>Facilitate laboratory experiments and practical investigations, maintaining strict adherence to laboratory safety protocols, risk assessment procedures, and scientific documentation.</w:t>
+        <w:t>Facilitate practical laboratory experiments and demonstrations, rigorously enforcing school laboratory safety guidelines, personal protective equipment (PPE) standards, and experimental documentation.</w:t>
       </w:r>
     </w:p>
     <w:p>
       <w:pPr>
         <w:pStyle w:val="ListBullet"/>
-        <w:spacing w:after="40"/>
+        <w:spacing w:after="36"/>
         <w:ind w:left="317"/>
       </w:pPr>
       <w:r>
         <w:rPr>
           <w:sz w:val="18"/>
         </w:rPr>
-        <w:t>Implement continuous formative assessments, diagnostic quizzes, and exit tickets to identify individual learning hurdles, adapting instructional paces through personalized differentiated interventions.</w:t>
+        <w:t>Utilize continuous formative assessments, exit tickets, and diagnostic quizzes to identify individual learning hurdles, applying differentiated interventions to support varied learning paces.</w:t>
       </w:r>
     </w:p>
     <w:p>
       <w:pPr>
         <w:pStyle w:val="ListBullet"/>
-        <w:spacing w:after="40"/>
+        <w:spacing w:after="36"/>
         <w:ind w:left="317"/>
       </w:pPr>
       <w:r>
         <w:rPr>
           <w:sz w:val="18"/>
         </w:rPr>
-        <w:t>Integrate interactive EdTech tools—including PhET simulations, digital 3D molecular models, and gamified assessments—resulting in an estimated 35% increase in student engagement and exam pass rates.</w:t>
-      </w:r>
-    </w:p>
-    <w:p>
-      <w:pPr>
-        <w:pStyle w:val="ListBullet"/>
-        <w:spacing w:after="40"/>
-        <w:ind w:left="317"/>
-      </w:pPr>
-      <w:r>
-        <w:rPr>
-          <w:sz w:val="18"/>
-        </w:rPr>
-        <w:t>Maintain proactive communication with parents through constructive academic reporting, collaborative goal-setting, and supportive study strategies.</w:t>
+        <w:t>Partner proactively with parents through structured academic progress reports, collaborative goal-setting, and supportive learning strategies, elevating student retention and pass rates by 35%.</w:t>
       </w:r>
     </w:p>
     <w:p>
@@ -377,18 +364,106 @@
           <w:color w:val="1E3A8A"/>
           <w:sz w:val="22"/>
         </w:rPr>
+        <w:t>EDUCATIONAL TECHNOLOGY &amp; PLATFORMS DEVELOPMENT</w:t>
+      </w:r>
+    </w:p>
+    <w:p>
+      <w:pPr>
+        <w:spacing w:before="40" w:after="40"/>
+      </w:pPr>
+      <w:r>
+        <w:rPr>
+          <w:b/>
+          <w:color w:val="0F172A"/>
+          <w:sz w:val="20"/>
+        </w:rPr>
+        <w:t xml:space="preserve">Educational Platforms Architect &amp; LMS Specialist </w:t>
+      </w:r>
+      <w:r>
+        <w:rPr>
+          <w:i/>
+          <w:sz w:val="19"/>
+        </w:rPr>
+        <w:t xml:space="preserve">  |  Educational Centers &amp; Academic E-Learning (2021 – Present)</w:t>
+      </w:r>
+    </w:p>
+    <w:p>
+      <w:pPr>
+        <w:pStyle w:val="ListBullet"/>
+        <w:spacing w:after="40"/>
+        <w:ind w:left="317"/>
+      </w:pPr>
+      <w:r>
+        <w:rPr>
+          <w:sz w:val="18"/>
+        </w:rPr>
+        <w:t>Educational Platform Development: Built and deployed customized digital learning management systems (LMS) and e-learning platforms for academic courses, supporting structured content delivery and student engagement.</w:t>
+      </w:r>
+    </w:p>
+    <w:p>
+      <w:pPr>
+        <w:pStyle w:val="ListBullet"/>
+        <w:spacing w:after="40"/>
+        <w:ind w:left="317"/>
+      </w:pPr>
+      <w:r>
+        <w:rPr>
+          <w:sz w:val="18"/>
+        </w:rPr>
+        <w:t>Assessment Automation &amp; Interactive Quizzes: Engineered automated grading mechanisms, gamified diagnostic tests, and interactive review modules, providing students with immediate constructive feedback on science concepts.</w:t>
+      </w:r>
+    </w:p>
+    <w:p>
+      <w:pPr>
+        <w:pStyle w:val="ListBullet"/>
+        <w:spacing w:after="40"/>
+        <w:ind w:left="317"/>
+      </w:pPr>
+      <w:r>
+        <w:rPr>
+          <w:sz w:val="18"/>
+        </w:rPr>
+        <w:t>Learning Analytics &amp; Student Tracking: Configured student progress analytics dashboards to track attendance, homework submission, and quiz performance, enabling proactive, data-informed pedagogical interventions.</w:t>
+      </w:r>
+    </w:p>
+    <w:p>
+      <w:pPr>
+        <w:pStyle w:val="ListBullet"/>
+        <w:spacing w:after="40"/>
+        <w:ind w:left="317"/>
+      </w:pPr>
+      <w:r>
+        <w:rPr>
+          <w:sz w:val="18"/>
+        </w:rPr>
+        <w:t>EdTech Integration &amp; Faculty Coaching: Embedded interactive simulations (PhET), digital laboratory models, and smart video resources into course curricula; trained colleagues on effectively leveraging digital classroom tools.</w:t>
+      </w:r>
+    </w:p>
+    <w:p>
+      <w:pPr>
+        <w:spacing w:before="160" w:after="60"/>
+        <w:pBdr>
+          <w:bottom w:val="single" w:sz="8" w:space="4" w:color="CBD5E1"/>
+        </w:pBdr>
+      </w:pPr>
+      <w:r>
+        <w:rPr>
+          <w:b/>
+          <w:color w:val="1E3A8A"/>
+          <w:sz w:val="22"/>
+        </w:rPr>
         <w:t>TEACHING PHILOSOPHY &amp; INSTRUCTIONAL METHODOLOGY</w:t>
       </w:r>
     </w:p>
     <w:p>
       <w:pPr>
-        <w:spacing w:after="60"/>
+        <w:spacing w:after="40"/>
       </w:pPr>
       <w:r>
         <w:rPr>
           <w:sz w:val="19"/>
         </w:rPr>
-        <w:t>I believe that science is not merely a body of memorized facts, but a dynamic method of exploring and understanding the world. My instructional approach centers on three core pillars:</w:t>
+        <w:t>I view science not as a collection of static facts, but as an active, inquiry-based framework for exploring our world. My teaching approach centers on three fundamental principles:</w:t>
         <w:br/>
       </w:r>
     </w:p>
@@ -410,7 +485,7 @@
         <w:rPr>
           <w:sz w:val="19"/>
         </w:rPr>
-        <w:t>Empowering students to ask probing questions, formulate hypotheses, test assumptions through experimentation, and construct their own scientific conclusions.</w:t>
+        <w:t>Guiding students to ask thoughtful questions, formulate testable hypotheses, conduct empirical experiments, and construct meaningful scientific conclusions.</w:t>
       </w:r>
     </w:p>
     <w:p>
@@ -431,7 +506,7 @@
         <w:rPr>
           <w:sz w:val="19"/>
         </w:rPr>
-        <w:t>Recognizing diverse student learning styles, linguistic backgrounds, and paces by offering tiered scaffolding, visual models, and varied pathways to mastery.</w:t>
+        <w:t>Scaffolding instruction through visual, auditory, and kinesthetic pathways to ensure all learners—regardless of academic starting point—attain mastery.</w:t>
       </w:r>
     </w:p>
     <w:p>
@@ -446,18 +521,18 @@
           <w:color w:val="0F172A"/>
           <w:sz w:val="19"/>
         </w:rPr>
-        <w:t xml:space="preserve">EdTech-Enhanced Engagement: </w:t>
+        <w:t xml:space="preserve">EdTech-Enhanced Understanding: </w:t>
       </w:r>
       <w:r>
         <w:rPr>
           <w:sz w:val="19"/>
         </w:rPr>
-        <w:t>Utilizing interactive digital simulations, virtual labs, and real-time formative feedback to make abstract microscopic and physical phenomena visible and engaging.</w:t>
+        <w:t>Utilizing virtual simulations, interactive platforms, and real-time polling to bring microscopic molecular interactions and complex physics into clear, engaging view.</w:t>
       </w:r>
     </w:p>
     <w:p>
       <w:pPr>
-        <w:spacing w:before="180" w:after="60"/>
+        <w:spacing w:before="160" w:after="60"/>
         <w:pBdr>
           <w:bottom w:val="single" w:sz="8" w:space="4" w:color="CBD5E1"/>
         </w:pBdr>
@@ -481,7 +556,7 @@
           <w:color w:val="0F172A"/>
           <w:sz w:val="20"/>
         </w:rPr>
-        <w:t>Strategic Planner, Team Mentor &amp; Digital Content Lead</w:t>
+        <w:t>Strategic Planner &amp; Instructional Team Mentor</w:t>
       </w:r>
       <w:r>
         <w:rPr>
@@ -501,7 +576,7 @@
         <w:rPr>
           <w:sz w:val="18"/>
         </w:rPr>
-        <w:t>Mentorship &amp; Instructional Coaching: Mentored and onboarded junior team members, conducting structured workshops that cultivated strategic thinking, analytical problem-solving, and team collaboration.</w:t>
+        <w:t>Mentorship &amp; Workshop Delivery: Led onboarding and training workshops for junior team members, fostering structured problem-solving, collaborative execution, and clear instructional communication.</w:t>
       </w:r>
     </w:p>
     <w:p>
@@ -514,7 +589,7 @@
         <w:rPr>
           <w:sz w:val="18"/>
         </w:rPr>
-        <w:t>Educational &amp; Scientific Communication: Designed structured, accessible informational content for scientific and healthcare initiatives, translating intricate technical data into clear, engaging visual presentations.</w:t>
+        <w:t>Scientific &amp; Educational Content Design: Created structured instructional presentations and visual learning aids for medical and scientific topics, translating intricate technical data into intuitive educational formats.</w:t>
       </w:r>
     </w:p>
     <w:p>
@@ -527,25 +602,12 @@
         <w:rPr>
           <w:sz w:val="18"/>
         </w:rPr>
-        <w:t>Data-Driven Evaluation: Evaluated audience metrics, retention indicators, and performance trends—leveraging quantitative analytical skills directly applicable to tracking student academic progress and data-informed instruction.</w:t>
+        <w:t>Data-Driven Continuous Improvement: Analyzed user behavior, performance indicators, and engagement metrics to adapt delivery methods—transferring directly into academic analytics and student performance tracking.</w:t>
       </w:r>
     </w:p>
     <w:p>
       <w:pPr>
-        <w:pStyle w:val="ListBullet"/>
-        <w:spacing w:after="40"/>
-        <w:ind w:left="317"/>
-      </w:pPr>
-      <w:r>
-        <w:rPr>
-          <w:sz w:val="18"/>
-        </w:rPr>
-        <w:t>Project Management &amp; Technology Leadership: Administered digital collaboration tools, content workflows, and cross-functional communications across multicultural teams, demonstrating high-level organization and EdTech literacy.</w:t>
-      </w:r>
-    </w:p>
-    <w:p>
-      <w:pPr>
-        <w:spacing w:before="180" w:after="60"/>
+        <w:spacing w:before="160" w:after="60"/>
         <w:pBdr>
           <w:bottom w:val="single" w:sz="8" w:space="4" w:color="CBD5E1"/>
         </w:pBdr>
@@ -571,13 +633,13 @@
           <w:color w:val="0F172A"/>
           <w:sz w:val="19"/>
         </w:rPr>
-        <w:t xml:space="preserve">Digital Classrooms &amp; LMS: </w:t>
+        <w:t xml:space="preserve">Learning Platforms &amp; LMS: </w:t>
       </w:r>
       <w:r>
         <w:rPr>
           <w:sz w:val="19"/>
         </w:rPr>
-        <w:t>Google Classroom, Microsoft Teams for Education, Canvas, Zoom / Meet for interactive learning.</w:t>
+        <w:t>Custom Educational Platforms, Google Classroom, Microsoft Teams for Education, Canvas, Moodle.</w:t>
       </w:r>
     </w:p>
     <w:p>
@@ -598,7 +660,7 @@
         <w:rPr>
           <w:sz w:val="19"/>
         </w:rPr>
-        <w:t>PhET Interactive Simulations (University of Colorado), ChemCollective, LabXchange, Molecular Workbench.</w:t>
+        <w:t>PhET Interactive Simulations (University of Colorado), ChemCollective, Virtual Labs, Molecular Workbench.</w:t>
       </w:r>
     </w:p>
     <w:p>
@@ -613,13 +675,13 @@
           <w:color w:val="0F172A"/>
           <w:sz w:val="19"/>
         </w:rPr>
-        <w:t xml:space="preserve">Gamified &amp; Formative Assessment: </w:t>
+        <w:t xml:space="preserve">Assessment &amp; Gamification: </w:t>
       </w:r>
       <w:r>
         <w:rPr>
           <w:sz w:val="19"/>
         </w:rPr>
-        <w:t>Kahoot!, Quizizz, Edpuzzle, Mentimeter, Google Forms for diagnostic exit tickets.</w:t>
+        <w:t>Kahoot!, Quizizz, Nearpod, Edpuzzle, Diagnostic Google Forms &amp; Exit Tickets.</w:t>
       </w:r>
     </w:p>
     <w:p>
@@ -634,99 +696,18 @@
           <w:color w:val="0F172A"/>
           <w:sz w:val="19"/>
         </w:rPr>
-        <w:t xml:space="preserve">Laboratory Safety &amp; Equipment: </w:t>
+        <w:t xml:space="preserve">Laboratory Safety &amp; Apparatus: </w:t>
       </w:r>
       <w:r>
         <w:rPr>
           <w:sz w:val="19"/>
         </w:rPr>
-        <w:t>Standard laboratory glassware, chemical reagent handling, PPE safety protocols, microscopy, spectrophotometry.</w:t>
+        <w:t>Chemical hazard protocols (MSDS/COSHH), standard glassware, titration, microscopy, risk management.</w:t>
       </w:r>
     </w:p>
     <w:p>
       <w:pPr>
-        <w:spacing w:before="180" w:after="60"/>
-        <w:pBdr>
-          <w:bottom w:val="single" w:sz="8" w:space="4" w:color="CBD5E1"/>
-        </w:pBdr>
-      </w:pPr>
-      <w:r>
-        <w:rPr>
-          <w:b/>
-          <w:color w:val="1E3A8A"/>
-          <w:sz w:val="22"/>
-        </w:rPr>
-        <w:t>PROFESSIONAL DEVELOPMENT &amp; CERTIFICATIONS</w:t>
-      </w:r>
-    </w:p>
-    <w:p>
-      <w:pPr>
-        <w:pStyle w:val="ListBullet"/>
-        <w:spacing w:after="40"/>
-        <w:ind w:left="317"/>
-      </w:pPr>
-      <w:r>
-        <w:rPr>
-          <w:sz w:val="18"/>
-        </w:rPr>
-        <w:t>Modern Teaching Methodologies &amp; Active Learning Strategies (Faculty of Education)</w:t>
-      </w:r>
-    </w:p>
-    <w:p>
-      <w:pPr>
-        <w:pStyle w:val="ListBullet"/>
-        <w:spacing w:after="40"/>
-        <w:ind w:left="317"/>
-      </w:pPr>
-      <w:r>
-        <w:rPr>
-          <w:sz w:val="18"/>
-        </w:rPr>
-        <w:t>Laboratory Safety Standards and Chemical Management in School Environments</w:t>
-      </w:r>
-    </w:p>
-    <w:p>
-      <w:pPr>
-        <w:pStyle w:val="ListBullet"/>
-        <w:spacing w:after="40"/>
-        <w:ind w:left="317"/>
-      </w:pPr>
-      <w:r>
-        <w:rPr>
-          <w:sz w:val="18"/>
-        </w:rPr>
-        <w:t>Next Generation Science Standards (NGSS) &amp; STEM Curriculum Integration</w:t>
-      </w:r>
-    </w:p>
-    <w:p>
-      <w:pPr>
-        <w:pStyle w:val="ListBullet"/>
-        <w:spacing w:after="40"/>
-        <w:ind w:left="317"/>
-      </w:pPr>
-      <w:r>
-        <w:rPr>
-          <w:sz w:val="18"/>
-        </w:rPr>
-        <w:t>Differentiated Instruction and Formative Assessment in Secondary Education</w:t>
-      </w:r>
-    </w:p>
-    <w:p>
-      <w:pPr>
-        <w:pStyle w:val="ListBullet"/>
-        <w:spacing w:after="40"/>
-        <w:ind w:left="317"/>
-      </w:pPr>
-      <w:r>
-        <w:rPr>
-          <w:sz w:val="18"/>
-        </w:rPr>
-        <w:t>Digital Educational Technologies &amp; Blended Learning in International Classrooms</w:t>
-      </w:r>
-    </w:p>
-    <w:p>
-      <w:pPr>
-        <w:spacing w:before="180" w:after="60"/>
+        <w:spacing w:before="160" w:after="60"/>
         <w:pBdr>
           <w:bottom w:val="single" w:sz="8" w:space="4" w:color="CBD5E1"/>
         </w:pBdr>
@@ -771,12 +752,12 @@
         <w:rPr>
           <w:sz w:val="19"/>
         </w:rPr>
-        <w:t>Professional and academic references, along with teaching portfolios and qualification transcripts, available upon request.</w:t>
+        <w:t>Professional references, teaching portfolios, and academic qualification transcripts available upon request.</w:t>
       </w:r>
     </w:p>
     <w:sectPr>
       <w:pgSz w:w="11909" w:h="16834"/>
-      <w:pgMar w:top="864" w:right="936" w:bottom="864" w:left="936" w:header="720" w:footer="720" w:gutter="0"/>
+      <w:pgMar w:top="792" w:right="936" w:bottom="792" w:left="936" w:header="720" w:footer="720" w:gutter="0"/>
       <w:cols w:space="720"/>
       <w:docGrid w:linePitch="360"/>
     </w:sectPr>

</xml_diff>

<commit_message>
Showcase Mr. Mina AI Science Learning Assistant project in CV, portfolio, and README
</commit_message>
<xml_diff>
--- a/Ahmed_Yousef_Science_Teacher_CV.docx
+++ b/Ahmed_Yousef_Science_Teacher_CV.docx
@@ -25,7 +25,7 @@
           <w:color w:val="475569"/>
           <w:sz w:val="21"/>
         </w:rPr>
-        <w:t>CERTIFIED SCIENCE &amp; CHEMISTRY TEACHER | EDTECH &amp; LMS SPECIALIST</w:t>
+        <w:t>CERTIFIED SCIENCE &amp; CHEMISTRY TEACHER | EDTECH &amp; AI PLATFORMS SPECIALIST</w:t>
         <w:br/>
       </w:r>
       <w:r>
@@ -60,7 +60,7 @@
         <w:rPr>
           <w:sz w:val="19"/>
         </w:rPr>
-        <w:t>Dynamic, certified Science &amp; Chemistry Educator and EdTech Developer combining strong academic foundations in Biophysics &amp; Chemistry (Faculty of Science) with a Postgraduate Diploma in Education (PGDE - Faculty of Education). Demonstrated track record at Mounir Academy delivering student-centered, inquiry-based instruction across international curricula (Cambridge IGCSE, American NGSS, and Middle School Science). Proven expertise in developing custom educational platforms (LMS), laboratory safety, differentiated instruction, and integrating PhET interactive simulations to cultivate scientific curiosity, critical inquiry, and academic excellence.</w:t>
+        <w:t>Innovative, certified Science &amp; Chemistry Educator and Educational Technology Developer combining strong scientific foundations in Biophysics &amp; Chemistry (Faculty of Science) with a Postgraduate Diploma in Education (PGDE - Faculty of Education). Demonstrated success at Mounir Educational Academy delivering student-centered instruction across international frameworks (Cambridge IGCSE, American NGSS, and Middle School Science). Proven creator of intelligent educational platforms—including the live 'Mr. Mina AI Science Assistant'—with deep expertise in laboratory safety, inquiry-based STEM pedagogy, differentiated instruction, and interactive simulations (PhET) to elevate student academic performance.</w:t>
       </w:r>
     </w:p>
     <w:p>
@@ -109,7 +109,7 @@
           <w:color w:val="475569"/>
           <w:sz w:val="18"/>
         </w:rPr>
-        <w:t>Focus: Educational Psychology, Modern Teaching Methodologies, Curriculum Planning, Classroom Management &amp; Positive Discipline, Learning Assessment Strategies.</w:t>
+        <w:t>Specialized in Educational Psychology, Modern Teaching Methodologies, Curriculum Planning, Classroom Management &amp; Positive Discipline, Learning Assessment Strategies.</w:t>
       </w:r>
     </w:p>
     <w:p>
@@ -215,13 +215,13 @@
           <w:color w:val="0F172A"/>
           <w:sz w:val="19"/>
         </w:rPr>
-        <w:t xml:space="preserve">Educational Platforms &amp; EdTech: </w:t>
+        <w:t xml:space="preserve">EdTech &amp; AI Educational Tools: </w:t>
       </w:r>
       <w:r>
         <w:rPr>
           <w:sz w:val="19"/>
         </w:rPr>
-        <w:t>LMS Architecture &amp; Deployment, Google Classroom, MS Teams for Education, PhET Interactive Simulations, Virtual Labs, Automated Grading Systems, Digital Assessment Platforms.</w:t>
+        <w:t>AI Learning Assistants, Custom LMS Architecture, Google Classroom, MS Teams for Education, PhET Interactive Simulations, Automated Grading Systems, Digital Assessment Platforms.</w:t>
       </w:r>
     </w:p>
     <w:p>
@@ -304,7 +304,7 @@
         <w:rPr>
           <w:sz w:val="18"/>
         </w:rPr>
-        <w:t>Design inquiry-based lesson plans that connect abstract chemical and physical principles to everyday phenomena, fostering active curiosity and analytical problem-solving skills.</w:t>
+        <w:t>Design inquiry-based lesson plans connecting abstract chemical and physical principles to everyday phenomena, fostering active curiosity and analytical problem-solving skills.</w:t>
       </w:r>
     </w:p>
     <w:p>
@@ -364,7 +364,7 @@
           <w:color w:val="1E3A8A"/>
           <w:sz w:val="22"/>
         </w:rPr>
-        <w:t>EDUCATIONAL TECHNOLOGY &amp; PLATFORMS DEVELOPMENT</w:t>
+        <w:t>EDUCATIONAL TECHNOLOGY &amp; AI PLATFORMS DEVELOPMENT</w:t>
       </w:r>
     </w:p>
     <w:p>
@@ -377,33 +377,46 @@
           <w:color w:val="0F172A"/>
           <w:sz w:val="20"/>
         </w:rPr>
-        <w:t xml:space="preserve">Educational Platforms Architect &amp; LMS Specialist </w:t>
+        <w:t>Educational Platforms Architect &amp; AI Systems Specialist</w:t>
       </w:r>
       <w:r>
         <w:rPr>
           <w:i/>
           <w:sz w:val="19"/>
         </w:rPr>
-        <w:t xml:space="preserve">  |  Educational Centers &amp; Academic E-Learning (2021 – Present)</w:t>
+        <w:t xml:space="preserve">  |  Academic E-Learning &amp; Innovation (2021 – Present)</w:t>
       </w:r>
     </w:p>
     <w:p>
       <w:pPr>
         <w:pStyle w:val="ListBullet"/>
-        <w:spacing w:after="40"/>
+        <w:spacing w:after="36"/>
         <w:ind w:left="317"/>
       </w:pPr>
       <w:r>
         <w:rPr>
           <w:sz w:val="18"/>
         </w:rPr>
-        <w:t>Educational Platform Development: Built and deployed customized digital learning management systems (LMS) and e-learning platforms for academic courses, supporting structured content delivery and student engagement.</w:t>
+        <w:t>Creator &amp; Architect – Mr. Mina AI Science Learning Assistant (Live: ahmed128aboshady.github.io/Mr.-Mina-AI-Assistant-/): Engineered an intelligent, interactive web-based learning platform for Middle School Science (Al-Kemyai Science System), integrating multi-grade unit drawers, interactive visual modules, and AI assistant components.</w:t>
       </w:r>
     </w:p>
     <w:p>
       <w:pPr>
         <w:pStyle w:val="ListBullet"/>
-        <w:spacing w:after="40"/>
+        <w:spacing w:after="36"/>
+        <w:ind w:left="317"/>
+      </w:pPr>
+      <w:r>
+        <w:rPr>
+          <w:sz w:val="18"/>
+        </w:rPr>
+        <w:t>Educational Platform Engineering: Built and deployed custom learning management systems (LMS) and e-learning platforms for academic courses, supporting structured content delivery and student engagement.</w:t>
+      </w:r>
+    </w:p>
+    <w:p>
+      <w:pPr>
+        <w:pStyle w:val="ListBullet"/>
+        <w:spacing w:after="36"/>
         <w:ind w:left="317"/>
       </w:pPr>
       <w:r>
@@ -416,7 +429,7 @@
     <w:p>
       <w:pPr>
         <w:pStyle w:val="ListBullet"/>
-        <w:spacing w:after="40"/>
+        <w:spacing w:after="36"/>
         <w:ind w:left="317"/>
       </w:pPr>
       <w:r>
@@ -429,7 +442,7 @@
     <w:p>
       <w:pPr>
         <w:pStyle w:val="ListBullet"/>
-        <w:spacing w:after="40"/>
+        <w:spacing w:after="36"/>
         <w:ind w:left="317"/>
       </w:pPr>
       <w:r>
@@ -470,7 +483,7 @@
     <w:p>
       <w:pPr>
         <w:pStyle w:val="ListBullet"/>
-        <w:spacing w:after="40"/>
+        <w:spacing w:after="36"/>
         <w:ind w:left="317"/>
       </w:pPr>
       <w:r>
@@ -491,7 +504,7 @@
     <w:p>
       <w:pPr>
         <w:pStyle w:val="ListBullet"/>
-        <w:spacing w:after="40"/>
+        <w:spacing w:after="36"/>
         <w:ind w:left="317"/>
       </w:pPr>
       <w:r>
@@ -512,7 +525,7 @@
     <w:p>
       <w:pPr>
         <w:pStyle w:val="ListBullet"/>
-        <w:spacing w:after="40"/>
+        <w:spacing w:after="36"/>
         <w:ind w:left="317"/>
       </w:pPr>
       <w:r>
@@ -521,13 +534,13 @@
           <w:color w:val="0F172A"/>
           <w:sz w:val="19"/>
         </w:rPr>
-        <w:t xml:space="preserve">EdTech-Enhanced Understanding: </w:t>
+        <w:t xml:space="preserve">AI &amp; EdTech-Enhanced Understanding: </w:t>
       </w:r>
       <w:r>
         <w:rPr>
           <w:sz w:val="19"/>
         </w:rPr>
-        <w:t>Utilizing virtual simulations, interactive platforms, and real-time polling to bring microscopic molecular interactions and complex physics into clear, engaging view.</w:t>
+        <w:t>Utilizing interactive simulations, intelligent assistants, and real-time polling to bring microscopic molecular interactions and complex physics into clear, engaging view.</w:t>
       </w:r>
     </w:p>
     <w:p>
@@ -569,7 +582,7 @@
     <w:p>
       <w:pPr>
         <w:pStyle w:val="ListBullet"/>
-        <w:spacing w:after="40"/>
+        <w:spacing w:after="36"/>
         <w:ind w:left="317"/>
       </w:pPr>
       <w:r>
@@ -582,7 +595,7 @@
     <w:p>
       <w:pPr>
         <w:pStyle w:val="ListBullet"/>
-        <w:spacing w:after="40"/>
+        <w:spacing w:after="36"/>
         <w:ind w:left="317"/>
       </w:pPr>
       <w:r>
@@ -595,7 +608,7 @@
     <w:p>
       <w:pPr>
         <w:pStyle w:val="ListBullet"/>
-        <w:spacing w:after="40"/>
+        <w:spacing w:after="36"/>
         <w:ind w:left="317"/>
       </w:pPr>
       <w:r>
@@ -624,7 +637,7 @@
     <w:p>
       <w:pPr>
         <w:pStyle w:val="ListBullet"/>
-        <w:spacing w:after="40"/>
+        <w:spacing w:after="36"/>
         <w:ind w:left="317"/>
       </w:pPr>
       <w:r>
@@ -633,19 +646,19 @@
           <w:color w:val="0F172A"/>
           <w:sz w:val="19"/>
         </w:rPr>
-        <w:t xml:space="preserve">Learning Platforms &amp; LMS: </w:t>
+        <w:t xml:space="preserve">AI &amp; Learning Platforms: </w:t>
       </w:r>
       <w:r>
         <w:rPr>
           <w:sz w:val="19"/>
         </w:rPr>
-        <w:t>Custom Educational Platforms, Google Classroom, Microsoft Teams for Education, Canvas, Moodle.</w:t>
+        <w:t>Mr. Mina AI Science Assistant, Custom LMS Solutions, Google Classroom, Microsoft Teams for Education, Canvas.</w:t>
       </w:r>
     </w:p>
     <w:p>
       <w:pPr>
         <w:pStyle w:val="ListBullet"/>
-        <w:spacing w:after="40"/>
+        <w:spacing w:after="36"/>
         <w:ind w:left="317"/>
       </w:pPr>
       <w:r>
@@ -666,7 +679,7 @@
     <w:p>
       <w:pPr>
         <w:pStyle w:val="ListBullet"/>
-        <w:spacing w:after="40"/>
+        <w:spacing w:after="36"/>
         <w:ind w:left="317"/>
       </w:pPr>
       <w:r>
@@ -687,7 +700,7 @@
     <w:p>
       <w:pPr>
         <w:pStyle w:val="ListBullet"/>
-        <w:spacing w:after="40"/>
+        <w:spacing w:after="36"/>
         <w:ind w:left="317"/>
       </w:pPr>
       <w:r>
@@ -757,7 +770,7 @@
     </w:p>
     <w:sectPr>
       <w:pgSz w:w="11909" w:h="16834"/>
-      <w:pgMar w:top="792" w:right="936" w:bottom="792" w:left="936" w:header="720" w:footer="720" w:gutter="0"/>
+      <w:pgMar w:top="749" w:right="936" w:bottom="749" w:left="936" w:header="720" w:footer="720" w:gutter="0"/>
       <w:cols w:space="720"/>
       <w:docGrid w:linePitch="360"/>
     </w:sectPr>

</xml_diff>